<commit_message>
Add Report course work and task list
</commit_message>
<xml_diff>
--- a/Documentation/Official documents/DOCX/Календарный план.docx
+++ b/Documentation/Official documents/DOCX/Календарный план.docx
@@ -116,7 +116,7 @@
           <w:sz w:val="28"/>
           <w:u w:val="single"/>
         </w:rPr>
-        <w:t>К</w:t>
+        <w:t>Доцент кафедры СП, к.ф.-м.н</w:t>
       </w:r>
       <w:r>
         <w:rPr>
@@ -124,15 +124,7 @@
           <w:sz w:val="28"/>
           <w:u w:val="single"/>
         </w:rPr>
-        <w:t>.ф.-м.н., ст.преп</w:t>
-      </w:r>
-      <w:r>
-        <w:rPr>
-          <w:rFonts w:ascii="Times New Roman" w:hAnsi="Times New Roman"/>
-          <w:sz w:val="28"/>
-          <w:u w:val="single"/>
-        </w:rPr>
-        <w:t>одаватель</w:t>
+        <w:t>.</w:t>
       </w:r>
       <w:r>
         <w:rPr>
@@ -205,17 +197,7 @@
           <w:sz w:val="28"/>
           <w:u w:val="single"/>
         </w:rPr>
-        <w:t>Разработка приложения дл</w:t>
-      </w:r>
-      <w:bookmarkStart w:id="0" w:name="_GoBack"/>
-      <w:bookmarkEnd w:id="0"/>
-      <w:r>
-        <w:rPr>
-          <w:rFonts w:ascii="Times New Roman" w:hAnsi="Times New Roman"/>
-          <w:sz w:val="28"/>
-          <w:u w:val="single"/>
-        </w:rPr>
-        <w:t xml:space="preserve">я решения задач по идентификации </w:t>
+        <w:t xml:space="preserve">Разработка приложения для решения задач по идентификации </w:t>
       </w:r>
       <w:r>
         <w:rPr>
@@ -262,6 +244,8 @@
         </w:rPr>
         <w:tab/>
       </w:r>
+      <w:bookmarkStart w:id="0" w:name="_GoBack"/>
+      <w:bookmarkEnd w:id="0"/>
     </w:p>
     <w:p>
       <w:pPr>
@@ -3670,7 +3654,6 @@
   <w:style w:type="character" w:default="1" w:styleId="a0">
     <w:name w:val="Default Paragraph Font"/>
     <w:uiPriority w:val="1"/>
-    <w:semiHidden/>
     <w:unhideWhenUsed/>
   </w:style>
   <w:style w:type="table" w:default="1" w:styleId="a1">
@@ -4143,7 +4126,7 @@
 </file>
 
 <file path=customXml/itemProps1.xml><?xml version="1.0" encoding="utf-8"?>
-<ds:datastoreItem xmlns:ds="http://schemas.openxmlformats.org/officeDocument/2006/customXml" ds:itemID="{A1511008-BA3C-4FE0-839D-5BE57AA294EB}">
+<ds:datastoreItem xmlns:ds="http://schemas.openxmlformats.org/officeDocument/2006/customXml" ds:itemID="{70BB5444-CB4A-43F0-961D-74BC5C5BFA40}">
   <ds:schemaRefs>
     <ds:schemaRef ds:uri="http://schemas.openxmlformats.org/officeDocument/2006/bibliography"/>
   </ds:schemaRefs>

</xml_diff>